<commit_message>
Update versão final do relatório com tabelas estilizadas
</commit_message>
<xml_diff>
--- a/relatorio/challenge2_telecom_x.docx
+++ b/relatorio/challenge2_telecom_x.docx
@@ -79,7 +79,6 @@
         </w:rPr>
         <w:t>O presente relatório tem como objetivo principal diagnosticar os fatores determinantes para a evasão de clientes (</w:t>
       </w:r>
-      <w:proofErr w:type="spellStart"/>
       <w:r>
         <w:rPr>
           <w:rFonts w:asciiTheme="minorBidi" w:hAnsiTheme="minorBidi"/>
@@ -90,7 +89,6 @@
         </w:rPr>
         <w:t>Churn</w:t>
       </w:r>
-      <w:proofErr w:type="spellEnd"/>
       <w:r>
         <w:rPr>
           <w:rFonts w:asciiTheme="minorBidi" w:hAnsiTheme="minorBidi"/>
@@ -201,23 +199,7 @@
           <w:sz w:val="22"/>
           <w:szCs w:val="22"/>
         </w:rPr>
-        <w:t xml:space="preserve"> </w:t>
-      </w:r>
-      <w:r>
-        <w:rPr>
-          <w:rFonts w:asciiTheme="minorBidi" w:hAnsiTheme="minorBidi"/>
-          <w:sz w:val="22"/>
-          <w:szCs w:val="22"/>
-        </w:rPr>
-        <w:t>Extração vis API requests e c</w:t>
-      </w:r>
-      <w:r>
-        <w:rPr>
-          <w:rFonts w:asciiTheme="minorBidi" w:hAnsiTheme="minorBidi"/>
-          <w:sz w:val="22"/>
-          <w:szCs w:val="22"/>
-        </w:rPr>
-        <w:t>onsolidação de dados brutos em formato JSON para estrutura tabular.</w:t>
+        <w:t xml:space="preserve"> Extração vis API requests e consolidação de dados brutos em formato JSON para estrutura tabular.</w:t>
       </w:r>
     </w:p>
     <w:p>
@@ -340,20 +322,8 @@
           <w:sz w:val="22"/>
           <w:szCs w:val="22"/>
         </w:rPr>
-        <w:t xml:space="preserve">3.1. Panorama Geral do </w:t>
-      </w:r>
-      <w:proofErr w:type="spellStart"/>
-      <w:r>
-        <w:rPr>
-          <w:rFonts w:asciiTheme="minorBidi" w:hAnsiTheme="minorBidi"/>
-          <w:b/>
-          <w:bCs/>
-          <w:sz w:val="22"/>
-          <w:szCs w:val="22"/>
-        </w:rPr>
-        <w:t>Churn</w:t>
-      </w:r>
-      <w:proofErr w:type="spellEnd"/>
+        <w:t>3.1. Panorama Geral do Churn</w:t>
+      </w:r>
     </w:p>
     <w:p>
       <w:pPr>
@@ -409,6 +379,68 @@
       <w:r>
         <w:rPr>
           <w:rFonts w:asciiTheme="minorBidi" w:hAnsiTheme="minorBidi"/>
+          <w:sz w:val="22"/>
+          <w:szCs w:val="22"/>
+        </w:rPr>
+        <w:drawing>
+          <wp:anchor distT="0" distB="0" distL="114300" distR="114300" simplePos="0" relativeHeight="251659264" behindDoc="0" locked="0" layoutInCell="1" allowOverlap="1" wp14:anchorId="72013562" wp14:editId="4791DD38">
+            <wp:simplePos x="0" y="0"/>
+            <wp:positionH relativeFrom="margin">
+              <wp:align>center</wp:align>
+            </wp:positionH>
+            <wp:positionV relativeFrom="paragraph">
+              <wp:posOffset>989874</wp:posOffset>
+            </wp:positionV>
+            <wp:extent cx="3867995" cy="1572985"/>
+            <wp:effectExtent l="0" t="0" r="0" b="8255"/>
+            <wp:wrapTopAndBottom/>
+            <wp:docPr id="381292687" name="Imagem 1"/>
+            <wp:cNvGraphicFramePr>
+              <a:graphicFrameLocks xmlns:a="http://schemas.openxmlformats.org/drawingml/2006/main" noChangeAspect="1"/>
+            </wp:cNvGraphicFramePr>
+            <a:graphic xmlns:a="http://schemas.openxmlformats.org/drawingml/2006/main">
+              <a:graphicData uri="http://schemas.openxmlformats.org/drawingml/2006/picture">
+                <pic:pic xmlns:pic="http://schemas.openxmlformats.org/drawingml/2006/picture">
+                  <pic:nvPicPr>
+                    <pic:cNvPr id="381292687" name=""/>
+                    <pic:cNvPicPr/>
+                  </pic:nvPicPr>
+                  <pic:blipFill>
+                    <a:blip r:embed="rId5">
+                      <a:extLst>
+                        <a:ext uri="{28A0092B-C50C-407E-A947-70E740481C1C}">
+                          <a14:useLocalDpi xmlns:a14="http://schemas.microsoft.com/office/drawing/2010/main" val="0"/>
+                        </a:ext>
+                      </a:extLst>
+                    </a:blip>
+                    <a:stretch>
+                      <a:fillRect/>
+                    </a:stretch>
+                  </pic:blipFill>
+                  <pic:spPr>
+                    <a:xfrm>
+                      <a:off x="0" y="0"/>
+                      <a:ext cx="3867995" cy="1572985"/>
+                    </a:xfrm>
+                    <a:prstGeom prst="rect">
+                      <a:avLst/>
+                    </a:prstGeom>
+                  </pic:spPr>
+                </pic:pic>
+              </a:graphicData>
+            </a:graphic>
+            <wp14:sizeRelH relativeFrom="margin">
+              <wp14:pctWidth>0</wp14:pctWidth>
+            </wp14:sizeRelH>
+            <wp14:sizeRelV relativeFrom="margin">
+              <wp14:pctHeight>0</wp14:pctHeight>
+            </wp14:sizeRelV>
+          </wp:anchor>
+        </w:drawing>
+      </w:r>
+      <w:r>
+        <w:rPr>
+          <w:rFonts w:asciiTheme="minorBidi" w:hAnsiTheme="minorBidi"/>
           <w:b/>
           <w:bCs/>
           <w:sz w:val="22"/>
@@ -431,31 +463,21 @@
         <w:jc w:val="both"/>
         <w:rPr>
           <w:rFonts w:asciiTheme="minorBidi" w:hAnsiTheme="minorBidi"/>
-          <w:sz w:val="22"/>
-          <w:szCs w:val="22"/>
-        </w:rPr>
-      </w:pPr>
-    </w:p>
-    <w:p>
-      <w:pPr>
-        <w:spacing w:line="360" w:lineRule="auto"/>
-        <w:jc w:val="both"/>
-        <w:rPr>
-          <w:rFonts w:asciiTheme="minorBidi" w:hAnsiTheme="minorBidi"/>
-          <w:b/>
-          <w:bCs/>
-          <w:sz w:val="22"/>
-          <w:szCs w:val="22"/>
-        </w:rPr>
-      </w:pPr>
-      <w:r>
-        <w:rPr>
-          <w:rFonts w:asciiTheme="minorBidi" w:hAnsiTheme="minorBidi"/>
-          <w:b/>
-          <w:bCs/>
-          <w:sz w:val="22"/>
-          <w:szCs w:val="22"/>
-        </w:rPr>
+          <w:b/>
+          <w:bCs/>
+          <w:sz w:val="22"/>
+          <w:szCs w:val="22"/>
+        </w:rPr>
+      </w:pPr>
+      <w:r>
+        <w:rPr>
+          <w:rFonts w:asciiTheme="minorBidi" w:hAnsiTheme="minorBidi"/>
+          <w:b/>
+          <w:bCs/>
+          <w:sz w:val="22"/>
+          <w:szCs w:val="22"/>
+        </w:rPr>
+        <w:lastRenderedPageBreak/>
         <w:t>3.2. O "Vilão" Operacional: Contratos Mensais</w:t>
       </w:r>
     </w:p>
@@ -492,43 +514,23 @@
           <w:szCs w:val="22"/>
         </w:rPr>
       </w:pPr>
-      <w:proofErr w:type="spellStart"/>
-      <w:r>
-        <w:rPr>
-          <w:rFonts w:asciiTheme="minorBidi" w:hAnsiTheme="minorBidi"/>
-          <w:b/>
-          <w:bCs/>
-          <w:sz w:val="22"/>
-          <w:szCs w:val="22"/>
-        </w:rPr>
-        <w:t>Month-to-month</w:t>
-      </w:r>
-      <w:proofErr w:type="spellEnd"/>
-      <w:r>
-        <w:rPr>
-          <w:rFonts w:asciiTheme="minorBidi" w:hAnsiTheme="minorBidi"/>
-          <w:b/>
-          <w:bCs/>
-          <w:sz w:val="22"/>
-          <w:szCs w:val="22"/>
-        </w:rPr>
-        <w:t xml:space="preserve"> (Mês a mês):</w:t>
-      </w:r>
-      <w:r>
-        <w:rPr>
-          <w:rFonts w:asciiTheme="minorBidi" w:hAnsiTheme="minorBidi"/>
-          <w:sz w:val="22"/>
-          <w:szCs w:val="22"/>
-        </w:rPr>
-        <w:t xml:space="preserve"> Apresenta a maior vulnerabilidade, com evasão </w:t>
-      </w:r>
-      <w:r>
-        <w:rPr>
-          <w:rFonts w:asciiTheme="minorBidi" w:hAnsiTheme="minorBidi"/>
-          <w:sz w:val="22"/>
-          <w:szCs w:val="22"/>
-        </w:rPr>
-        <w:t xml:space="preserve">de quase </w:t>
+      <w:r>
+        <w:rPr>
+          <w:rFonts w:asciiTheme="minorBidi" w:hAnsiTheme="minorBidi"/>
+          <w:b/>
+          <w:bCs/>
+          <w:sz w:val="22"/>
+          <w:szCs w:val="22"/>
+        </w:rPr>
+        <w:t>Month-to-month (Mês a mês):</w:t>
+      </w:r>
+      <w:r>
+        <w:rPr>
+          <w:rFonts w:asciiTheme="minorBidi" w:hAnsiTheme="minorBidi"/>
+          <w:sz w:val="22"/>
+          <w:szCs w:val="22"/>
+        </w:rPr>
+        <w:t xml:space="preserve"> Apresenta a maior vulnerabilidade, com evasão de quase </w:t>
       </w:r>
       <w:r>
         <w:rPr>
@@ -546,15 +548,7 @@
           <w:sz w:val="22"/>
           <w:szCs w:val="22"/>
         </w:rPr>
-        <w:t xml:space="preserve"> para perfis idosos e </w:t>
-      </w:r>
-      <w:r>
-        <w:rPr>
-          <w:rFonts w:asciiTheme="minorBidi" w:hAnsiTheme="minorBidi"/>
-          <w:sz w:val="22"/>
-          <w:szCs w:val="22"/>
-        </w:rPr>
-        <w:t xml:space="preserve">superior a </w:t>
+        <w:t xml:space="preserve"> para perfis idosos e superior a </w:t>
       </w:r>
       <w:r>
         <w:rPr>
@@ -572,15 +566,7 @@
           <w:sz w:val="22"/>
           <w:szCs w:val="22"/>
         </w:rPr>
-        <w:t xml:space="preserve"> mesmo em perfis jovens</w:t>
-      </w:r>
-      <w:r>
-        <w:rPr>
-          <w:rFonts w:asciiTheme="minorBidi" w:hAnsiTheme="minorBidi"/>
-          <w:sz w:val="22"/>
-          <w:szCs w:val="22"/>
-        </w:rPr>
-        <w:t>;</w:t>
+        <w:t xml:space="preserve"> mesmo em perfis jovens;</w:t>
       </w:r>
     </w:p>
     <w:p>
@@ -605,7 +591,6 @@
           <w:sz w:val="22"/>
           <w:szCs w:val="22"/>
         </w:rPr>
-        <w:lastRenderedPageBreak/>
         <w:t>Contratos de Dois Anos:</w:t>
       </w:r>
       <w:r>
@@ -732,729 +717,156 @@
           <w:sz w:val="22"/>
           <w:szCs w:val="22"/>
         </w:rPr>
-        <w:t xml:space="preserve"> é um agravante direto na probabilidade de </w:t>
-      </w:r>
-      <w:proofErr w:type="spellStart"/>
-      <w:r>
-        <w:rPr>
-          <w:rFonts w:asciiTheme="minorBidi" w:hAnsiTheme="minorBidi"/>
-          <w:sz w:val="22"/>
-          <w:szCs w:val="22"/>
-        </w:rPr>
-        <w:t>Churn</w:t>
-      </w:r>
-      <w:proofErr w:type="spellEnd"/>
-      <w:r>
-        <w:rPr>
-          <w:rFonts w:asciiTheme="minorBidi" w:hAnsiTheme="minorBidi"/>
-          <w:sz w:val="22"/>
-          <w:szCs w:val="22"/>
-        </w:rPr>
-        <w:t xml:space="preserve"> em todos os cenários.</w:t>
-      </w:r>
-    </w:p>
-    <w:p>
-      <w:pPr>
-        <w:spacing w:line="360" w:lineRule="auto"/>
-        <w:jc w:val="both"/>
-        <w:rPr>
-          <w:rFonts w:asciiTheme="minorBidi" w:hAnsiTheme="minorBidi"/>
-          <w:b/>
-          <w:bCs/>
-          <w:sz w:val="22"/>
-          <w:szCs w:val="22"/>
-        </w:rPr>
-      </w:pPr>
-    </w:p>
-    <w:tbl>
-      <w:tblPr>
-        <w:tblW w:w="9073" w:type="dxa"/>
-        <w:tblCellSpacing w:w="15" w:type="dxa"/>
-        <w:tblInd w:w="-292" w:type="dxa"/>
-        <w:tblCellMar>
-          <w:left w:w="0" w:type="dxa"/>
-          <w:right w:w="0" w:type="dxa"/>
-        </w:tblCellMar>
-        <w:tblLook w:val="04A0" w:firstRow="1" w:lastRow="0" w:firstColumn="1" w:lastColumn="0" w:noHBand="0" w:noVBand="1"/>
-      </w:tblPr>
-      <w:tblGrid>
-        <w:gridCol w:w="2411"/>
-        <w:gridCol w:w="2117"/>
-        <w:gridCol w:w="2135"/>
-        <w:gridCol w:w="2410"/>
-      </w:tblGrid>
-      <w:tr>
-        <w:trPr>
-          <w:tblHeader/>
-          <w:tblCellSpacing w:w="15" w:type="dxa"/>
-        </w:trPr>
-        <w:tc>
-          <w:tcPr>
-            <w:tcW w:w="2366" w:type="dxa"/>
-            <w:tcBorders>
-              <w:top w:val="single" w:sz="6" w:space="0" w:color="auto"/>
-              <w:left w:val="single" w:sz="6" w:space="0" w:color="auto"/>
-              <w:bottom w:val="single" w:sz="6" w:space="0" w:color="auto"/>
-              <w:right w:val="single" w:sz="6" w:space="0" w:color="auto"/>
-            </w:tcBorders>
-            <w:tcMar>
-              <w:top w:w="120" w:type="dxa"/>
-              <w:left w:w="180" w:type="dxa"/>
-              <w:bottom w:w="120" w:type="dxa"/>
-              <w:right w:w="180" w:type="dxa"/>
-            </w:tcMar>
-            <w:vAlign w:val="center"/>
-            <w:hideMark/>
-          </w:tcPr>
-          <w:p>
-            <w:pPr>
-              <w:spacing w:line="360" w:lineRule="auto"/>
-              <w:jc w:val="both"/>
-              <w:rPr>
-                <w:rFonts w:asciiTheme="minorBidi" w:hAnsiTheme="minorBidi"/>
-                <w:b/>
-                <w:bCs/>
-                <w:sz w:val="22"/>
-                <w:szCs w:val="22"/>
-              </w:rPr>
-            </w:pPr>
-            <w:r>
-              <w:rPr>
-                <w:rFonts w:asciiTheme="minorBidi" w:hAnsiTheme="minorBidi"/>
-                <w:b/>
-                <w:bCs/>
-                <w:sz w:val="22"/>
-                <w:szCs w:val="22"/>
-              </w:rPr>
-              <w:t>Tipo de Contrato</w:t>
-            </w:r>
-          </w:p>
-        </w:tc>
-        <w:tc>
-          <w:tcPr>
-            <w:tcW w:w="2087" w:type="dxa"/>
-            <w:tcBorders>
-              <w:top w:val="single" w:sz="6" w:space="0" w:color="auto"/>
-              <w:left w:val="single" w:sz="6" w:space="0" w:color="auto"/>
-              <w:bottom w:val="single" w:sz="6" w:space="0" w:color="auto"/>
-              <w:right w:val="single" w:sz="6" w:space="0" w:color="auto"/>
-            </w:tcBorders>
-            <w:tcMar>
-              <w:top w:w="120" w:type="dxa"/>
-              <w:left w:w="180" w:type="dxa"/>
-              <w:bottom w:w="120" w:type="dxa"/>
-              <w:right w:w="180" w:type="dxa"/>
-            </w:tcMar>
-            <w:vAlign w:val="center"/>
-            <w:hideMark/>
-          </w:tcPr>
-          <w:p>
-            <w:pPr>
-              <w:spacing w:line="360" w:lineRule="auto"/>
-              <w:jc w:val="both"/>
-              <w:rPr>
-                <w:rFonts w:asciiTheme="minorBidi" w:hAnsiTheme="minorBidi"/>
-                <w:b/>
-                <w:bCs/>
-                <w:sz w:val="22"/>
-                <w:szCs w:val="22"/>
-              </w:rPr>
-            </w:pPr>
-            <w:proofErr w:type="spellStart"/>
-            <w:r>
-              <w:rPr>
-                <w:rFonts w:asciiTheme="minorBidi" w:hAnsiTheme="minorBidi"/>
-                <w:b/>
-                <w:bCs/>
-                <w:sz w:val="22"/>
-                <w:szCs w:val="22"/>
-              </w:rPr>
-              <w:t>Churn</w:t>
-            </w:r>
-            <w:proofErr w:type="spellEnd"/>
-            <w:r>
-              <w:rPr>
-                <w:rFonts w:asciiTheme="minorBidi" w:hAnsiTheme="minorBidi"/>
-                <w:b/>
-                <w:bCs/>
-                <w:sz w:val="22"/>
-                <w:szCs w:val="22"/>
-              </w:rPr>
-              <w:t xml:space="preserve"> (Jovem)</w:t>
-            </w:r>
-          </w:p>
-        </w:tc>
-        <w:tc>
-          <w:tcPr>
-            <w:tcW w:w="2105" w:type="dxa"/>
-            <w:tcBorders>
-              <w:top w:val="single" w:sz="6" w:space="0" w:color="auto"/>
-              <w:left w:val="single" w:sz="6" w:space="0" w:color="auto"/>
-              <w:bottom w:val="single" w:sz="6" w:space="0" w:color="auto"/>
-              <w:right w:val="single" w:sz="6" w:space="0" w:color="auto"/>
-            </w:tcBorders>
-            <w:tcMar>
-              <w:top w:w="120" w:type="dxa"/>
-              <w:left w:w="180" w:type="dxa"/>
-              <w:bottom w:w="120" w:type="dxa"/>
-              <w:right w:w="180" w:type="dxa"/>
-            </w:tcMar>
-            <w:vAlign w:val="center"/>
-            <w:hideMark/>
-          </w:tcPr>
-          <w:p>
-            <w:pPr>
-              <w:spacing w:line="360" w:lineRule="auto"/>
-              <w:jc w:val="both"/>
-              <w:rPr>
-                <w:rFonts w:asciiTheme="minorBidi" w:hAnsiTheme="minorBidi"/>
-                <w:b/>
-                <w:bCs/>
-                <w:sz w:val="22"/>
-                <w:szCs w:val="22"/>
-              </w:rPr>
-            </w:pPr>
-            <w:proofErr w:type="spellStart"/>
-            <w:r>
-              <w:rPr>
-                <w:rFonts w:asciiTheme="minorBidi" w:hAnsiTheme="minorBidi"/>
-                <w:b/>
-                <w:bCs/>
-                <w:sz w:val="22"/>
-                <w:szCs w:val="22"/>
-              </w:rPr>
-              <w:t>Churn</w:t>
-            </w:r>
-            <w:proofErr w:type="spellEnd"/>
-            <w:r>
-              <w:rPr>
-                <w:rFonts w:asciiTheme="minorBidi" w:hAnsiTheme="minorBidi"/>
-                <w:b/>
-                <w:bCs/>
-                <w:sz w:val="22"/>
-                <w:szCs w:val="22"/>
-              </w:rPr>
-              <w:t xml:space="preserve"> (Idoso)</w:t>
-            </w:r>
-          </w:p>
-        </w:tc>
-        <w:tc>
-          <w:tcPr>
-            <w:tcW w:w="2365" w:type="dxa"/>
-            <w:tcBorders>
-              <w:top w:val="single" w:sz="6" w:space="0" w:color="auto"/>
-              <w:left w:val="single" w:sz="6" w:space="0" w:color="auto"/>
-              <w:bottom w:val="single" w:sz="6" w:space="0" w:color="auto"/>
-              <w:right w:val="single" w:sz="6" w:space="0" w:color="auto"/>
-            </w:tcBorders>
-            <w:tcMar>
-              <w:top w:w="120" w:type="dxa"/>
-              <w:left w:w="180" w:type="dxa"/>
-              <w:bottom w:w="120" w:type="dxa"/>
-              <w:right w:w="180" w:type="dxa"/>
-            </w:tcMar>
-            <w:vAlign w:val="center"/>
-            <w:hideMark/>
-          </w:tcPr>
-          <w:p>
-            <w:pPr>
-              <w:spacing w:line="360" w:lineRule="auto"/>
-              <w:jc w:val="both"/>
-              <w:rPr>
-                <w:rFonts w:asciiTheme="minorBidi" w:hAnsiTheme="minorBidi"/>
-                <w:b/>
-                <w:bCs/>
-                <w:sz w:val="22"/>
-                <w:szCs w:val="22"/>
-              </w:rPr>
-            </w:pPr>
-            <w:r>
-              <w:rPr>
-                <w:rFonts w:asciiTheme="minorBidi" w:hAnsiTheme="minorBidi"/>
-                <w:b/>
-                <w:bCs/>
-                <w:sz w:val="22"/>
-                <w:szCs w:val="22"/>
-              </w:rPr>
-              <w:t>Impacto Adicional</w:t>
-            </w:r>
-          </w:p>
-        </w:tc>
-      </w:tr>
-      <w:tr>
-        <w:trPr>
-          <w:tblCellSpacing w:w="15" w:type="dxa"/>
-        </w:trPr>
-        <w:tc>
-          <w:tcPr>
-            <w:tcW w:w="2366" w:type="dxa"/>
-            <w:tcBorders>
-              <w:top w:val="single" w:sz="6" w:space="0" w:color="auto"/>
-              <w:left w:val="single" w:sz="6" w:space="0" w:color="auto"/>
-              <w:bottom w:val="single" w:sz="6" w:space="0" w:color="auto"/>
-              <w:right w:val="single" w:sz="6" w:space="0" w:color="auto"/>
-            </w:tcBorders>
-            <w:tcMar>
-              <w:top w:w="120" w:type="dxa"/>
-              <w:left w:w="180" w:type="dxa"/>
-              <w:bottom w:w="120" w:type="dxa"/>
-              <w:right w:w="180" w:type="dxa"/>
-            </w:tcMar>
-            <w:vAlign w:val="center"/>
-            <w:hideMark/>
-          </w:tcPr>
-          <w:p>
-            <w:pPr>
-              <w:spacing w:line="360" w:lineRule="auto"/>
-              <w:jc w:val="both"/>
-              <w:rPr>
-                <w:rFonts w:asciiTheme="minorBidi" w:hAnsiTheme="minorBidi"/>
-                <w:sz w:val="22"/>
-                <w:szCs w:val="22"/>
-              </w:rPr>
-            </w:pPr>
-            <w:r>
-              <w:rPr>
-                <w:rFonts w:asciiTheme="minorBidi" w:hAnsiTheme="minorBidi"/>
-                <w:sz w:val="22"/>
-                <w:szCs w:val="22"/>
-              </w:rPr>
-              <w:t>Mês a Mês</w:t>
-            </w:r>
-          </w:p>
-        </w:tc>
-        <w:tc>
-          <w:tcPr>
-            <w:tcW w:w="2087" w:type="dxa"/>
-            <w:tcBorders>
-              <w:top w:val="single" w:sz="6" w:space="0" w:color="auto"/>
-              <w:left w:val="single" w:sz="6" w:space="0" w:color="auto"/>
-              <w:bottom w:val="single" w:sz="6" w:space="0" w:color="auto"/>
-              <w:right w:val="single" w:sz="6" w:space="0" w:color="auto"/>
-            </w:tcBorders>
-            <w:tcMar>
-              <w:top w:w="120" w:type="dxa"/>
-              <w:left w:w="180" w:type="dxa"/>
-              <w:bottom w:w="120" w:type="dxa"/>
-              <w:right w:w="180" w:type="dxa"/>
-            </w:tcMar>
-            <w:vAlign w:val="center"/>
-            <w:hideMark/>
-          </w:tcPr>
-          <w:p>
-            <w:pPr>
-              <w:spacing w:line="360" w:lineRule="auto"/>
-              <w:jc w:val="both"/>
-              <w:rPr>
-                <w:rFonts w:asciiTheme="minorBidi" w:hAnsiTheme="minorBidi"/>
-                <w:sz w:val="22"/>
-                <w:szCs w:val="22"/>
-              </w:rPr>
-            </w:pPr>
-            <w:r>
-              <w:rPr>
-                <w:rFonts w:asciiTheme="minorBidi" w:hAnsiTheme="minorBidi"/>
-                <w:sz w:val="22"/>
-                <w:szCs w:val="22"/>
-              </w:rPr>
-              <w:t>39,57%</w:t>
-            </w:r>
-          </w:p>
-        </w:tc>
-        <w:tc>
-          <w:tcPr>
-            <w:tcW w:w="2105" w:type="dxa"/>
-            <w:tcBorders>
-              <w:top w:val="single" w:sz="6" w:space="0" w:color="auto"/>
-              <w:left w:val="single" w:sz="6" w:space="0" w:color="auto"/>
-              <w:bottom w:val="single" w:sz="6" w:space="0" w:color="auto"/>
-              <w:right w:val="single" w:sz="6" w:space="0" w:color="auto"/>
-            </w:tcBorders>
-            <w:tcMar>
-              <w:top w:w="120" w:type="dxa"/>
-              <w:left w:w="180" w:type="dxa"/>
-              <w:bottom w:w="120" w:type="dxa"/>
-              <w:right w:w="180" w:type="dxa"/>
-            </w:tcMar>
-            <w:vAlign w:val="center"/>
-            <w:hideMark/>
-          </w:tcPr>
-          <w:p>
-            <w:pPr>
-              <w:spacing w:line="360" w:lineRule="auto"/>
-              <w:jc w:val="both"/>
-              <w:rPr>
-                <w:rFonts w:asciiTheme="minorBidi" w:hAnsiTheme="minorBidi"/>
-                <w:sz w:val="22"/>
-                <w:szCs w:val="22"/>
-              </w:rPr>
-            </w:pPr>
-            <w:r>
-              <w:rPr>
-                <w:rFonts w:asciiTheme="minorBidi" w:hAnsiTheme="minorBidi"/>
-                <w:b/>
-                <w:bCs/>
-                <w:sz w:val="22"/>
-                <w:szCs w:val="22"/>
-              </w:rPr>
-              <w:t>54,65%</w:t>
-            </w:r>
-          </w:p>
-        </w:tc>
-        <w:tc>
-          <w:tcPr>
-            <w:tcW w:w="2365" w:type="dxa"/>
-            <w:tcBorders>
-              <w:top w:val="single" w:sz="6" w:space="0" w:color="auto"/>
-              <w:left w:val="single" w:sz="6" w:space="0" w:color="auto"/>
-              <w:bottom w:val="single" w:sz="6" w:space="0" w:color="auto"/>
-              <w:right w:val="single" w:sz="6" w:space="0" w:color="auto"/>
-            </w:tcBorders>
-            <w:tcMar>
-              <w:top w:w="120" w:type="dxa"/>
-              <w:left w:w="180" w:type="dxa"/>
-              <w:bottom w:w="120" w:type="dxa"/>
-              <w:right w:w="180" w:type="dxa"/>
-            </w:tcMar>
-            <w:vAlign w:val="center"/>
-            <w:hideMark/>
-          </w:tcPr>
-          <w:p>
-            <w:pPr>
-              <w:spacing w:line="360" w:lineRule="auto"/>
-              <w:jc w:val="both"/>
-              <w:rPr>
-                <w:rFonts w:asciiTheme="minorBidi" w:hAnsiTheme="minorBidi"/>
-                <w:sz w:val="22"/>
-                <w:szCs w:val="22"/>
-              </w:rPr>
-            </w:pPr>
-            <w:r>
-              <w:rPr>
-                <w:rFonts w:asciiTheme="minorBidi" w:hAnsiTheme="minorBidi"/>
-                <w:sz w:val="22"/>
-                <w:szCs w:val="22"/>
-              </w:rPr>
-              <w:t>+15,08%</w:t>
-            </w:r>
-          </w:p>
-        </w:tc>
-      </w:tr>
-      <w:tr>
-        <w:trPr>
-          <w:tblCellSpacing w:w="15" w:type="dxa"/>
-        </w:trPr>
-        <w:tc>
-          <w:tcPr>
-            <w:tcW w:w="2366" w:type="dxa"/>
-            <w:tcBorders>
-              <w:top w:val="single" w:sz="6" w:space="0" w:color="auto"/>
-              <w:left w:val="single" w:sz="6" w:space="0" w:color="auto"/>
-              <w:bottom w:val="single" w:sz="6" w:space="0" w:color="auto"/>
-              <w:right w:val="single" w:sz="6" w:space="0" w:color="auto"/>
-            </w:tcBorders>
-            <w:tcMar>
-              <w:top w:w="120" w:type="dxa"/>
-              <w:left w:w="180" w:type="dxa"/>
-              <w:bottom w:w="120" w:type="dxa"/>
-              <w:right w:w="180" w:type="dxa"/>
-            </w:tcMar>
-            <w:vAlign w:val="center"/>
-            <w:hideMark/>
-          </w:tcPr>
-          <w:p>
-            <w:pPr>
-              <w:spacing w:line="360" w:lineRule="auto"/>
-              <w:jc w:val="both"/>
-              <w:rPr>
-                <w:rFonts w:asciiTheme="minorBidi" w:hAnsiTheme="minorBidi"/>
-                <w:sz w:val="22"/>
-                <w:szCs w:val="22"/>
-              </w:rPr>
-            </w:pPr>
-            <w:r>
-              <w:rPr>
-                <w:rFonts w:asciiTheme="minorBidi" w:hAnsiTheme="minorBidi"/>
-                <w:sz w:val="22"/>
-                <w:szCs w:val="22"/>
-              </w:rPr>
-              <w:t>Um Ano</w:t>
-            </w:r>
-          </w:p>
-        </w:tc>
-        <w:tc>
-          <w:tcPr>
-            <w:tcW w:w="2087" w:type="dxa"/>
-            <w:tcBorders>
-              <w:top w:val="single" w:sz="6" w:space="0" w:color="auto"/>
-              <w:left w:val="single" w:sz="6" w:space="0" w:color="auto"/>
-              <w:bottom w:val="single" w:sz="6" w:space="0" w:color="auto"/>
-              <w:right w:val="single" w:sz="6" w:space="0" w:color="auto"/>
-            </w:tcBorders>
-            <w:tcMar>
-              <w:top w:w="120" w:type="dxa"/>
-              <w:left w:w="180" w:type="dxa"/>
-              <w:bottom w:w="120" w:type="dxa"/>
-              <w:right w:w="180" w:type="dxa"/>
-            </w:tcMar>
-            <w:vAlign w:val="center"/>
-            <w:hideMark/>
-          </w:tcPr>
-          <w:p>
-            <w:pPr>
-              <w:spacing w:line="360" w:lineRule="auto"/>
-              <w:jc w:val="both"/>
-              <w:rPr>
-                <w:rFonts w:asciiTheme="minorBidi" w:hAnsiTheme="minorBidi"/>
-                <w:sz w:val="22"/>
-                <w:szCs w:val="22"/>
-              </w:rPr>
-            </w:pPr>
-            <w:r>
-              <w:rPr>
-                <w:rFonts w:asciiTheme="minorBidi" w:hAnsiTheme="minorBidi"/>
-                <w:sz w:val="22"/>
-                <w:szCs w:val="22"/>
-              </w:rPr>
-              <w:t>10,68%</w:t>
-            </w:r>
-          </w:p>
-        </w:tc>
-        <w:tc>
-          <w:tcPr>
-            <w:tcW w:w="2105" w:type="dxa"/>
-            <w:tcBorders>
-              <w:top w:val="single" w:sz="6" w:space="0" w:color="auto"/>
-              <w:left w:val="single" w:sz="6" w:space="0" w:color="auto"/>
-              <w:bottom w:val="single" w:sz="6" w:space="0" w:color="auto"/>
-              <w:right w:val="single" w:sz="6" w:space="0" w:color="auto"/>
-            </w:tcBorders>
-            <w:tcMar>
-              <w:top w:w="120" w:type="dxa"/>
-              <w:left w:w="180" w:type="dxa"/>
-              <w:bottom w:w="120" w:type="dxa"/>
-              <w:right w:w="180" w:type="dxa"/>
-            </w:tcMar>
-            <w:vAlign w:val="center"/>
-            <w:hideMark/>
-          </w:tcPr>
-          <w:p>
-            <w:pPr>
-              <w:spacing w:line="360" w:lineRule="auto"/>
-              <w:jc w:val="both"/>
-              <w:rPr>
-                <w:rFonts w:asciiTheme="minorBidi" w:hAnsiTheme="minorBidi"/>
-                <w:sz w:val="22"/>
-                <w:szCs w:val="22"/>
-              </w:rPr>
-            </w:pPr>
-            <w:r>
-              <w:rPr>
-                <w:rFonts w:asciiTheme="minorBidi" w:hAnsiTheme="minorBidi"/>
-                <w:sz w:val="22"/>
-                <w:szCs w:val="22"/>
-              </w:rPr>
-              <w:t>15,26%</w:t>
-            </w:r>
-          </w:p>
-        </w:tc>
-        <w:tc>
-          <w:tcPr>
-            <w:tcW w:w="2365" w:type="dxa"/>
-            <w:tcBorders>
-              <w:top w:val="single" w:sz="6" w:space="0" w:color="auto"/>
-              <w:left w:val="single" w:sz="6" w:space="0" w:color="auto"/>
-              <w:bottom w:val="single" w:sz="6" w:space="0" w:color="auto"/>
-              <w:right w:val="single" w:sz="6" w:space="0" w:color="auto"/>
-            </w:tcBorders>
-            <w:tcMar>
-              <w:top w:w="120" w:type="dxa"/>
-              <w:left w:w="180" w:type="dxa"/>
-              <w:bottom w:w="120" w:type="dxa"/>
-              <w:right w:w="180" w:type="dxa"/>
-            </w:tcMar>
-            <w:vAlign w:val="center"/>
-            <w:hideMark/>
-          </w:tcPr>
-          <w:p>
-            <w:pPr>
-              <w:spacing w:line="360" w:lineRule="auto"/>
-              <w:jc w:val="both"/>
-              <w:rPr>
-                <w:rFonts w:asciiTheme="minorBidi" w:hAnsiTheme="minorBidi"/>
-                <w:sz w:val="22"/>
-                <w:szCs w:val="22"/>
-              </w:rPr>
-            </w:pPr>
-            <w:r>
-              <w:rPr>
-                <w:rFonts w:asciiTheme="minorBidi" w:hAnsiTheme="minorBidi"/>
-                <w:sz w:val="22"/>
-                <w:szCs w:val="22"/>
-              </w:rPr>
-              <w:t>+4,58%</w:t>
-            </w:r>
-          </w:p>
-        </w:tc>
-      </w:tr>
-      <w:tr>
-        <w:trPr>
-          <w:tblCellSpacing w:w="15" w:type="dxa"/>
-        </w:trPr>
-        <w:tc>
-          <w:tcPr>
-            <w:tcW w:w="2366" w:type="dxa"/>
-            <w:tcBorders>
-              <w:top w:val="single" w:sz="6" w:space="0" w:color="auto"/>
-              <w:left w:val="single" w:sz="6" w:space="0" w:color="auto"/>
-              <w:bottom w:val="single" w:sz="6" w:space="0" w:color="auto"/>
-              <w:right w:val="single" w:sz="6" w:space="0" w:color="auto"/>
-            </w:tcBorders>
-            <w:tcMar>
-              <w:top w:w="120" w:type="dxa"/>
-              <w:left w:w="180" w:type="dxa"/>
-              <w:bottom w:w="120" w:type="dxa"/>
-              <w:right w:w="180" w:type="dxa"/>
-            </w:tcMar>
-            <w:vAlign w:val="center"/>
-            <w:hideMark/>
-          </w:tcPr>
-          <w:p>
-            <w:pPr>
-              <w:spacing w:line="360" w:lineRule="auto"/>
-              <w:jc w:val="both"/>
-              <w:rPr>
-                <w:rFonts w:asciiTheme="minorBidi" w:hAnsiTheme="minorBidi"/>
-                <w:sz w:val="22"/>
-                <w:szCs w:val="22"/>
-              </w:rPr>
-            </w:pPr>
-            <w:r>
-              <w:rPr>
-                <w:rFonts w:asciiTheme="minorBidi" w:hAnsiTheme="minorBidi"/>
-                <w:sz w:val="22"/>
-                <w:szCs w:val="22"/>
-              </w:rPr>
-              <w:t>Dois Anos</w:t>
-            </w:r>
-          </w:p>
-        </w:tc>
-        <w:tc>
-          <w:tcPr>
-            <w:tcW w:w="2087" w:type="dxa"/>
-            <w:tcBorders>
-              <w:top w:val="single" w:sz="6" w:space="0" w:color="auto"/>
-              <w:left w:val="single" w:sz="6" w:space="0" w:color="auto"/>
-              <w:bottom w:val="single" w:sz="6" w:space="0" w:color="auto"/>
-              <w:right w:val="single" w:sz="6" w:space="0" w:color="auto"/>
-            </w:tcBorders>
-            <w:tcMar>
-              <w:top w:w="120" w:type="dxa"/>
-              <w:left w:w="180" w:type="dxa"/>
-              <w:bottom w:w="120" w:type="dxa"/>
-              <w:right w:w="180" w:type="dxa"/>
-            </w:tcMar>
-            <w:vAlign w:val="center"/>
-            <w:hideMark/>
-          </w:tcPr>
-          <w:p>
-            <w:pPr>
-              <w:spacing w:line="360" w:lineRule="auto"/>
-              <w:jc w:val="both"/>
-              <w:rPr>
-                <w:rFonts w:asciiTheme="minorBidi" w:hAnsiTheme="minorBidi"/>
-                <w:sz w:val="22"/>
-                <w:szCs w:val="22"/>
-              </w:rPr>
-            </w:pPr>
-            <w:r>
-              <w:rPr>
-                <w:rFonts w:asciiTheme="minorBidi" w:hAnsiTheme="minorBidi"/>
-                <w:sz w:val="22"/>
-                <w:szCs w:val="22"/>
-              </w:rPr>
-              <w:t>2,71%</w:t>
-            </w:r>
-          </w:p>
-        </w:tc>
-        <w:tc>
-          <w:tcPr>
-            <w:tcW w:w="2105" w:type="dxa"/>
-            <w:tcBorders>
-              <w:top w:val="single" w:sz="6" w:space="0" w:color="auto"/>
-              <w:left w:val="single" w:sz="6" w:space="0" w:color="auto"/>
-              <w:bottom w:val="single" w:sz="6" w:space="0" w:color="auto"/>
-              <w:right w:val="single" w:sz="6" w:space="0" w:color="auto"/>
-            </w:tcBorders>
-            <w:tcMar>
-              <w:top w:w="120" w:type="dxa"/>
-              <w:left w:w="180" w:type="dxa"/>
-              <w:bottom w:w="120" w:type="dxa"/>
-              <w:right w:w="180" w:type="dxa"/>
-            </w:tcMar>
-            <w:vAlign w:val="center"/>
-            <w:hideMark/>
-          </w:tcPr>
-          <w:p>
-            <w:pPr>
-              <w:spacing w:line="360" w:lineRule="auto"/>
-              <w:jc w:val="both"/>
-              <w:rPr>
-                <w:rFonts w:asciiTheme="minorBidi" w:hAnsiTheme="minorBidi"/>
-                <w:sz w:val="22"/>
-                <w:szCs w:val="22"/>
-              </w:rPr>
-            </w:pPr>
-            <w:r>
-              <w:rPr>
-                <w:rFonts w:asciiTheme="minorBidi" w:hAnsiTheme="minorBidi"/>
-                <w:sz w:val="22"/>
-                <w:szCs w:val="22"/>
-              </w:rPr>
-              <w:t>4,14%</w:t>
-            </w:r>
-          </w:p>
-        </w:tc>
-        <w:tc>
-          <w:tcPr>
-            <w:tcW w:w="2365" w:type="dxa"/>
-            <w:tcBorders>
-              <w:top w:val="single" w:sz="6" w:space="0" w:color="auto"/>
-              <w:left w:val="single" w:sz="6" w:space="0" w:color="auto"/>
-              <w:bottom w:val="single" w:sz="6" w:space="0" w:color="auto"/>
-              <w:right w:val="single" w:sz="6" w:space="0" w:color="auto"/>
-            </w:tcBorders>
-            <w:tcMar>
-              <w:top w:w="120" w:type="dxa"/>
-              <w:left w:w="180" w:type="dxa"/>
-              <w:bottom w:w="120" w:type="dxa"/>
-              <w:right w:w="180" w:type="dxa"/>
-            </w:tcMar>
-            <w:vAlign w:val="center"/>
-            <w:hideMark/>
-          </w:tcPr>
-          <w:p>
-            <w:pPr>
-              <w:spacing w:line="360" w:lineRule="auto"/>
-              <w:jc w:val="both"/>
-              <w:rPr>
-                <w:rFonts w:asciiTheme="minorBidi" w:hAnsiTheme="minorBidi"/>
-                <w:sz w:val="22"/>
-                <w:szCs w:val="22"/>
-              </w:rPr>
-            </w:pPr>
-            <w:r>
-              <w:rPr>
-                <w:rFonts w:asciiTheme="minorBidi" w:hAnsiTheme="minorBidi"/>
-                <w:sz w:val="22"/>
-                <w:szCs w:val="22"/>
-              </w:rPr>
-              <w:t>+1,43%</w:t>
-            </w:r>
-          </w:p>
-        </w:tc>
-      </w:tr>
-    </w:tbl>
+        <w:t xml:space="preserve"> é um agravante direto na probabilidade de Churn em todos os cenários.</w:t>
+      </w:r>
+    </w:p>
+    <w:p>
+      <w:pPr>
+        <w:spacing w:line="360" w:lineRule="auto"/>
+        <w:jc w:val="both"/>
+        <w:rPr>
+          <w:rFonts w:asciiTheme="minorBidi" w:hAnsiTheme="minorBidi"/>
+          <w:b/>
+          <w:bCs/>
+          <w:sz w:val="22"/>
+          <w:szCs w:val="22"/>
+        </w:rPr>
+      </w:pPr>
+    </w:p>
+    <w:p>
+      <w:pPr>
+        <w:spacing w:line="360" w:lineRule="auto"/>
+        <w:jc w:val="both"/>
+        <w:rPr>
+          <w:rFonts w:asciiTheme="minorBidi" w:hAnsiTheme="minorBidi"/>
+          <w:b/>
+          <w:bCs/>
+          <w:sz w:val="22"/>
+          <w:szCs w:val="22"/>
+        </w:rPr>
+      </w:pPr>
+      <w:r>
+        <w:rPr>
+          <w:rFonts w:asciiTheme="minorBidi" w:hAnsiTheme="minorBidi"/>
+          <w:b/>
+          <w:bCs/>
+          <w:sz w:val="22"/>
+          <w:szCs w:val="22"/>
+        </w:rPr>
+        <w:drawing>
+          <wp:anchor distT="0" distB="0" distL="114300" distR="114300" simplePos="0" relativeHeight="251658240" behindDoc="1" locked="0" layoutInCell="1" allowOverlap="1" wp14:anchorId="2055BC2B" wp14:editId="6D3F1031">
+            <wp:simplePos x="0" y="0"/>
+            <wp:positionH relativeFrom="column">
+              <wp:posOffset>585924</wp:posOffset>
+            </wp:positionH>
+            <wp:positionV relativeFrom="paragraph">
+              <wp:posOffset>6713</wp:posOffset>
+            </wp:positionV>
+            <wp:extent cx="4250871" cy="2137178"/>
+            <wp:effectExtent l="0" t="0" r="0" b="0"/>
+            <wp:wrapTight wrapText="bothSides">
+              <wp:wrapPolygon edited="0">
+                <wp:start x="0" y="0"/>
+                <wp:lineTo x="0" y="21375"/>
+                <wp:lineTo x="21490" y="21375"/>
+                <wp:lineTo x="21490" y="0"/>
+                <wp:lineTo x="0" y="0"/>
+              </wp:wrapPolygon>
+            </wp:wrapTight>
+            <wp:docPr id="135465642" name="Imagem 1"/>
+            <wp:cNvGraphicFramePr>
+              <a:graphicFrameLocks xmlns:a="http://schemas.openxmlformats.org/drawingml/2006/main" noChangeAspect="1"/>
+            </wp:cNvGraphicFramePr>
+            <a:graphic xmlns:a="http://schemas.openxmlformats.org/drawingml/2006/main">
+              <a:graphicData uri="http://schemas.openxmlformats.org/drawingml/2006/picture">
+                <pic:pic xmlns:pic="http://schemas.openxmlformats.org/drawingml/2006/picture">
+                  <pic:nvPicPr>
+                    <pic:cNvPr id="135465642" name=""/>
+                    <pic:cNvPicPr/>
+                  </pic:nvPicPr>
+                  <pic:blipFill>
+                    <a:blip r:embed="rId6">
+                      <a:extLst>
+                        <a:ext uri="{28A0092B-C50C-407E-A947-70E740481C1C}">
+                          <a14:useLocalDpi xmlns:a14="http://schemas.microsoft.com/office/drawing/2010/main" val="0"/>
+                        </a:ext>
+                      </a:extLst>
+                    </a:blip>
+                    <a:stretch>
+                      <a:fillRect/>
+                    </a:stretch>
+                  </pic:blipFill>
+                  <pic:spPr>
+                    <a:xfrm>
+                      <a:off x="0" y="0"/>
+                      <a:ext cx="4250871" cy="2137178"/>
+                    </a:xfrm>
+                    <a:prstGeom prst="rect">
+                      <a:avLst/>
+                    </a:prstGeom>
+                  </pic:spPr>
+                </pic:pic>
+              </a:graphicData>
+            </a:graphic>
+          </wp:anchor>
+        </w:drawing>
+      </w:r>
+    </w:p>
+    <w:p>
+      <w:pPr>
+        <w:spacing w:line="360" w:lineRule="auto"/>
+        <w:jc w:val="both"/>
+        <w:rPr>
+          <w:rFonts w:asciiTheme="minorBidi" w:hAnsiTheme="minorBidi"/>
+          <w:sz w:val="22"/>
+          <w:szCs w:val="22"/>
+        </w:rPr>
+      </w:pPr>
+    </w:p>
+    <w:p>
+      <w:pPr>
+        <w:spacing w:line="360" w:lineRule="auto"/>
+        <w:jc w:val="both"/>
+        <w:rPr>
+          <w:rFonts w:asciiTheme="minorBidi" w:hAnsiTheme="minorBidi"/>
+          <w:sz w:val="22"/>
+          <w:szCs w:val="22"/>
+        </w:rPr>
+      </w:pPr>
+    </w:p>
+    <w:p>
+      <w:pPr>
+        <w:spacing w:line="360" w:lineRule="auto"/>
+        <w:jc w:val="both"/>
+        <w:rPr>
+          <w:rFonts w:asciiTheme="minorBidi" w:hAnsiTheme="minorBidi"/>
+          <w:sz w:val="22"/>
+          <w:szCs w:val="22"/>
+        </w:rPr>
+      </w:pPr>
+    </w:p>
+    <w:p>
+      <w:pPr>
+        <w:spacing w:line="360" w:lineRule="auto"/>
+        <w:jc w:val="both"/>
+        <w:rPr>
+          <w:rFonts w:asciiTheme="minorBidi" w:hAnsiTheme="minorBidi"/>
+          <w:sz w:val="22"/>
+          <w:szCs w:val="22"/>
+        </w:rPr>
+      </w:pPr>
+    </w:p>
+    <w:p>
+      <w:pPr>
+        <w:spacing w:line="360" w:lineRule="auto"/>
+        <w:jc w:val="both"/>
+        <w:rPr>
+          <w:rFonts w:asciiTheme="minorBidi" w:hAnsiTheme="minorBidi"/>
+          <w:sz w:val="22"/>
+          <w:szCs w:val="22"/>
+        </w:rPr>
+      </w:pPr>
+    </w:p>
     <w:p>
       <w:pPr>
         <w:spacing w:line="360" w:lineRule="auto"/>
@@ -1544,6 +956,140 @@
           <w14:ligatures w14:val="none"/>
         </w:rPr>
       </w:pPr>
+    </w:p>
+    <w:p>
+      <w:pPr>
+        <w:spacing w:line="360" w:lineRule="auto"/>
+        <w:jc w:val="both"/>
+        <w:rPr>
+          <w:rFonts w:asciiTheme="minorBidi" w:eastAsia="Times New Roman" w:hAnsiTheme="minorBidi"/>
+          <w:b/>
+          <w:bCs/>
+          <w:kern w:val="0"/>
+          <w:sz w:val="22"/>
+          <w:szCs w:val="22"/>
+          <w:lang w:eastAsia="pt-BR"/>
+          <w14:ligatures w14:val="none"/>
+        </w:rPr>
+      </w:pPr>
+    </w:p>
+    <w:p>
+      <w:pPr>
+        <w:spacing w:line="360" w:lineRule="auto"/>
+        <w:jc w:val="both"/>
+        <w:rPr>
+          <w:rFonts w:asciiTheme="minorBidi" w:eastAsia="Times New Roman" w:hAnsiTheme="minorBidi"/>
+          <w:b/>
+          <w:bCs/>
+          <w:kern w:val="0"/>
+          <w:sz w:val="22"/>
+          <w:szCs w:val="22"/>
+          <w:lang w:eastAsia="pt-BR"/>
+          <w14:ligatures w14:val="none"/>
+        </w:rPr>
+      </w:pPr>
+    </w:p>
+    <w:p>
+      <w:pPr>
+        <w:spacing w:line="360" w:lineRule="auto"/>
+        <w:jc w:val="both"/>
+        <w:rPr>
+          <w:rFonts w:asciiTheme="minorBidi" w:eastAsia="Times New Roman" w:hAnsiTheme="minorBidi"/>
+          <w:b/>
+          <w:bCs/>
+          <w:kern w:val="0"/>
+          <w:sz w:val="22"/>
+          <w:szCs w:val="22"/>
+          <w:lang w:eastAsia="pt-BR"/>
+          <w14:ligatures w14:val="none"/>
+        </w:rPr>
+      </w:pPr>
+      <w:r>
+        <w:rPr>
+          <w:rFonts w:asciiTheme="minorBidi" w:eastAsia="Times New Roman" w:hAnsiTheme="minorBidi"/>
+          <w:b/>
+          <w:bCs/>
+          <w:noProof/>
+          <w:kern w:val="0"/>
+          <w:sz w:val="22"/>
+          <w:szCs w:val="22"/>
+          <w:lang w:eastAsia="pt-BR"/>
+        </w:rPr>
+        <w:lastRenderedPageBreak/>
+        <w:drawing>
+          <wp:inline distT="0" distB="0" distL="0" distR="0" wp14:anchorId="6A85DEE1" wp14:editId="51314916">
+            <wp:extent cx="5400040" cy="3422650"/>
+            <wp:effectExtent l="0" t="0" r="0" b="6350"/>
+            <wp:docPr id="210827637" name="Imagem 1"/>
+            <wp:cNvGraphicFramePr>
+              <a:graphicFrameLocks xmlns:a="http://schemas.openxmlformats.org/drawingml/2006/main" noChangeAspect="1"/>
+            </wp:cNvGraphicFramePr>
+            <a:graphic xmlns:a="http://schemas.openxmlformats.org/drawingml/2006/main">
+              <a:graphicData uri="http://schemas.openxmlformats.org/drawingml/2006/picture">
+                <pic:pic xmlns:pic="http://schemas.openxmlformats.org/drawingml/2006/picture">
+                  <pic:nvPicPr>
+                    <pic:cNvPr id="210827637" name="Imagem 210827637"/>
+                    <pic:cNvPicPr/>
+                  </pic:nvPicPr>
+                  <pic:blipFill>
+                    <a:blip r:embed="rId7">
+                      <a:extLst>
+                        <a:ext uri="{28A0092B-C50C-407E-A947-70E740481C1C}">
+                          <a14:useLocalDpi xmlns:a14="http://schemas.microsoft.com/office/drawing/2010/main" val="0"/>
+                        </a:ext>
+                      </a:extLst>
+                    </a:blip>
+                    <a:stretch>
+                      <a:fillRect/>
+                    </a:stretch>
+                  </pic:blipFill>
+                  <pic:spPr>
+                    <a:xfrm>
+                      <a:off x="0" y="0"/>
+                      <a:ext cx="5400040" cy="3422650"/>
+                    </a:xfrm>
+                    <a:prstGeom prst="rect">
+                      <a:avLst/>
+                    </a:prstGeom>
+                  </pic:spPr>
+                </pic:pic>
+              </a:graphicData>
+            </a:graphic>
+          </wp:inline>
+        </w:drawing>
+      </w:r>
+    </w:p>
+    <w:p>
+      <w:pPr>
+        <w:spacing w:line="360" w:lineRule="auto"/>
+        <w:jc w:val="both"/>
+        <w:rPr>
+          <w:rFonts w:asciiTheme="minorBidi" w:eastAsia="Times New Roman" w:hAnsiTheme="minorBidi"/>
+          <w:b/>
+          <w:bCs/>
+          <w:kern w:val="0"/>
+          <w:sz w:val="22"/>
+          <w:szCs w:val="22"/>
+          <w:lang w:eastAsia="pt-BR"/>
+          <w14:ligatures w14:val="none"/>
+        </w:rPr>
+      </w:pPr>
+    </w:p>
+    <w:p>
+      <w:pPr>
+        <w:spacing w:line="360" w:lineRule="auto"/>
+        <w:jc w:val="both"/>
+        <w:rPr>
+          <w:rFonts w:asciiTheme="minorBidi" w:eastAsia="Times New Roman" w:hAnsiTheme="minorBidi"/>
+          <w:b/>
+          <w:bCs/>
+          <w:kern w:val="0"/>
+          <w:sz w:val="22"/>
+          <w:szCs w:val="22"/>
+          <w:lang w:eastAsia="pt-BR"/>
+          <w14:ligatures w14:val="none"/>
+        </w:rPr>
+      </w:pPr>
       <w:r>
         <w:rPr>
           <w:rFonts w:asciiTheme="minorBidi" w:eastAsia="Times New Roman" w:hAnsiTheme="minorBidi"/>
@@ -1712,7 +1258,6 @@
           <w:sz w:val="22"/>
           <w:szCs w:val="22"/>
         </w:rPr>
-        <w:lastRenderedPageBreak/>
         <w:t>6. Conclusões e Recomendações Estratégicas</w:t>
       </w:r>
     </w:p>
@@ -1733,25 +1278,7 @@
           <w:sz w:val="22"/>
           <w:szCs w:val="22"/>
         </w:rPr>
-        <w:t xml:space="preserve">A análise demonstra que o </w:t>
-      </w:r>
-      <w:proofErr w:type="spellStart"/>
-      <w:r>
-        <w:rPr>
-          <w:rFonts w:asciiTheme="minorBidi" w:hAnsiTheme="minorBidi"/>
-          <w:sz w:val="22"/>
-          <w:szCs w:val="22"/>
-        </w:rPr>
-        <w:t>Churn</w:t>
-      </w:r>
-      <w:proofErr w:type="spellEnd"/>
-      <w:r>
-        <w:rPr>
-          <w:rFonts w:asciiTheme="minorBidi" w:hAnsiTheme="minorBidi"/>
-          <w:sz w:val="22"/>
-          <w:szCs w:val="22"/>
-        </w:rPr>
-        <w:t xml:space="preserve"> na Telecom X não é aleatório, mas sim estrutural. Para reverter o cenário atual de 25,72% de perda, recomenda-se:</w:t>
+        <w:t>A análise demonstra que o Churn na Telecom X não é aleatório, mas sim estrutural. Para reverter o cenário atual de 25,72% de perda, recomenda-se:</w:t>
       </w:r>
     </w:p>
     <w:p>
@@ -1785,25 +1312,7 @@
           <w:sz w:val="22"/>
           <w:szCs w:val="22"/>
         </w:rPr>
-        <w:t xml:space="preserve"> Implementar uma campanha agressiva de conversão de clientes "Mês a Mês" para planos anuais. O uso de contratos de longo prazo atua como uma "solução térmica", reduzindo o </w:t>
-      </w:r>
-      <w:proofErr w:type="spellStart"/>
-      <w:r>
-        <w:rPr>
-          <w:rFonts w:asciiTheme="minorBidi" w:hAnsiTheme="minorBidi"/>
-          <w:sz w:val="22"/>
-          <w:szCs w:val="22"/>
-        </w:rPr>
-        <w:t>Churn</w:t>
-      </w:r>
-      <w:proofErr w:type="spellEnd"/>
-      <w:r>
-        <w:rPr>
-          <w:rFonts w:asciiTheme="minorBidi" w:hAnsiTheme="minorBidi"/>
-          <w:sz w:val="22"/>
-          <w:szCs w:val="22"/>
-        </w:rPr>
-        <w:t xml:space="preserve"> de 54% para níveis abaixo de 5% no público idoso.</w:t>
+        <w:t xml:space="preserve"> Implementar uma campanha agressiva de conversão de clientes "Mês a Mês" para planos anuais. O uso de contratos de longo prazo atua como uma "solução térmica", reduzindo o Churn de 54% para níveis abaixo de 5% no público idoso.</w:t>
       </w:r>
     </w:p>
     <w:p>
@@ -1839,7 +1348,6 @@
         </w:rPr>
         <w:t xml:space="preserve"> Focar esforços de CS (</w:t>
       </w:r>
-      <w:proofErr w:type="spellStart"/>
       <w:r>
         <w:rPr>
           <w:rFonts w:asciiTheme="minorBidi" w:hAnsiTheme="minorBidi"/>
@@ -1848,56 +1356,15 @@
           <w:sz w:val="22"/>
           <w:szCs w:val="22"/>
         </w:rPr>
-        <w:t>Customer</w:t>
-      </w:r>
-      <w:proofErr w:type="spellEnd"/>
-      <w:r>
-        <w:rPr>
-          <w:rFonts w:asciiTheme="minorBidi" w:hAnsiTheme="minorBidi"/>
-          <w:i/>
-          <w:iCs/>
-          <w:sz w:val="22"/>
-          <w:szCs w:val="22"/>
-        </w:rPr>
-        <w:t xml:space="preserve"> </w:t>
-      </w:r>
-      <w:proofErr w:type="spellStart"/>
-      <w:r>
-        <w:rPr>
-          <w:rFonts w:asciiTheme="minorBidi" w:hAnsiTheme="minorBidi"/>
-          <w:i/>
-          <w:iCs/>
-          <w:sz w:val="22"/>
-          <w:szCs w:val="22"/>
-        </w:rPr>
-        <w:t>Success</w:t>
-      </w:r>
-      <w:proofErr w:type="spellEnd"/>
-      <w:r>
-        <w:rPr>
-          <w:rFonts w:asciiTheme="minorBidi" w:hAnsiTheme="minorBidi"/>
-          <w:sz w:val="22"/>
-          <w:szCs w:val="22"/>
-        </w:rPr>
-        <w:t xml:space="preserve">) e suporte prioritário nos primeiros 180 dias de contrato, período </w:t>
-      </w:r>
-      <w:proofErr w:type="gramStart"/>
-      <w:r>
-        <w:rPr>
-          <w:rFonts w:asciiTheme="minorBidi" w:hAnsiTheme="minorBidi"/>
-          <w:sz w:val="22"/>
-          <w:szCs w:val="22"/>
-        </w:rPr>
-        <w:t>onde</w:t>
-      </w:r>
-      <w:proofErr w:type="gramEnd"/>
-      <w:r>
-        <w:rPr>
-          <w:rFonts w:asciiTheme="minorBidi" w:hAnsiTheme="minorBidi"/>
-          <w:sz w:val="22"/>
-          <w:szCs w:val="22"/>
-        </w:rPr>
-        <w:t xml:space="preserve"> ocorre a maior parte das desistências.</w:t>
+        <w:t>Customer Success</w:t>
+      </w:r>
+      <w:r>
+        <w:rPr>
+          <w:rFonts w:asciiTheme="minorBidi" w:hAnsiTheme="minorBidi"/>
+          <w:sz w:val="22"/>
+          <w:szCs w:val="22"/>
+        </w:rPr>
+        <w:t>) e suporte prioritário nos primeiros 180 dias de contrato, período onde ocorre a maior parte das desistências.</w:t>
       </w:r>
     </w:p>
     <w:p>
@@ -1923,6 +1390,7 @@
           <w:sz w:val="22"/>
           <w:szCs w:val="22"/>
         </w:rPr>
+        <w:lastRenderedPageBreak/>
         <w:t>Programa de Fidelidade para Idosos:</w:t>
       </w:r>
       <w:r>
@@ -2019,23 +1487,7 @@
           <w:sz w:val="22"/>
           <w:szCs w:val="22"/>
         </w:rPr>
-        <w:t xml:space="preserve"> </w:t>
-      </w:r>
-      <w:r>
-        <w:rPr>
-          <w:rFonts w:asciiTheme="minorBidi" w:hAnsiTheme="minorBidi"/>
-          <w:sz w:val="22"/>
-          <w:szCs w:val="22"/>
-        </w:rPr>
-        <w:t>Vanclercio da Rocha Pontes</w:t>
-      </w:r>
-      <w:r>
-        <w:rPr>
-          <w:rFonts w:asciiTheme="minorBidi" w:hAnsiTheme="minorBidi"/>
-          <w:sz w:val="22"/>
-          <w:szCs w:val="22"/>
-        </w:rPr>
-        <w:t xml:space="preserve"> </w:t>
+        <w:t xml:space="preserve"> Vanclercio da Rocha Pontes </w:t>
       </w:r>
     </w:p>
     <w:p>
@@ -2065,54 +1517,8 @@
           <w:sz w:val="22"/>
           <w:szCs w:val="22"/>
         </w:rPr>
-        <w:t xml:space="preserve"> </w:t>
-      </w:r>
-      <w:proofErr w:type="spellStart"/>
-      <w:r>
-        <w:rPr>
-          <w:rFonts w:asciiTheme="minorBidi" w:hAnsiTheme="minorBidi"/>
-          <w:sz w:val="22"/>
-          <w:szCs w:val="22"/>
-        </w:rPr>
-        <w:t>Challenge</w:t>
-      </w:r>
-      <w:proofErr w:type="spellEnd"/>
-      <w:r>
-        <w:rPr>
-          <w:rFonts w:asciiTheme="minorBidi" w:hAnsiTheme="minorBidi"/>
-          <w:sz w:val="22"/>
-          <w:szCs w:val="22"/>
-        </w:rPr>
-        <w:t xml:space="preserve"> Telecom X - Oracle </w:t>
-      </w:r>
-      <w:proofErr w:type="spellStart"/>
-      <w:r>
-        <w:rPr>
-          <w:rFonts w:asciiTheme="minorBidi" w:hAnsiTheme="minorBidi"/>
-          <w:sz w:val="22"/>
-          <w:szCs w:val="22"/>
-        </w:rPr>
-        <w:t>One</w:t>
-      </w:r>
-      <w:proofErr w:type="spellEnd"/>
-      <w:r>
-        <w:rPr>
-          <w:rFonts w:asciiTheme="minorBidi" w:hAnsiTheme="minorBidi"/>
-          <w:sz w:val="22"/>
-          <w:szCs w:val="22"/>
-        </w:rPr>
-        <w:t xml:space="preserve"> / </w:t>
-      </w:r>
-      <w:proofErr w:type="spellStart"/>
-      <w:r>
-        <w:rPr>
-          <w:rFonts w:asciiTheme="minorBidi" w:hAnsiTheme="minorBidi"/>
-          <w:sz w:val="22"/>
-          <w:szCs w:val="22"/>
-        </w:rPr>
-        <w:t>Alura</w:t>
-      </w:r>
-      <w:proofErr w:type="spellEnd"/>
+        <w:t xml:space="preserve"> Challenge Telecom X - Oracle One / Alura</w:t>
+      </w:r>
     </w:p>
     <w:p>
       <w:pPr>
@@ -3582,6 +2988,7 @@
   <w:style w:type="character" w:default="1" w:styleId="Fontepargpadro">
     <w:name w:val="Default Paragraph Font"/>
     <w:uiPriority w:val="1"/>
+    <w:semiHidden/>
     <w:unhideWhenUsed/>
   </w:style>
   <w:style w:type="table" w:default="1" w:styleId="Tabelanormal">

</xml_diff>